<commit_message>
paper: add faculty affiliation and contact link
</commit_message>
<xml_diff>
--- a/paper/Chronos_Final_Research_Paper.docx
+++ b/paper/Chronos_Final_Research_Paper.docx
@@ -111,7 +111,7 @@
     <w:p>
       <w:pPr>
         <w:widowControl/>
-        <w:spacing w:after="680"/>
+        <w:spacing w:after="0"/>
         <w:ind w:firstLine="0"/>
         <w:jc w:val="center"/>
       </w:pPr>
@@ -121,8 +121,59 @@
           <w:color w:val="000000"/>
           <w:sz w:val="22"/>
         </w:rPr>
-        <w:t>Guide: Dr. Poornima N, VIT Vellore</w:t>
+        <w:t>Guide: Dr. Poornima N</w:t>
       </w:r>
+    </w:p>
+    <w:p>
+      <w:pPr>
+        <w:widowControl/>
+        <w:spacing w:after="0"/>
+        <w:ind w:firstLine="0"/>
+        <w:jc w:val="center"/>
+      </w:pPr>
+      <w:r>
+        <w:rPr>
+          <w:rFonts w:ascii="Times New Roman" w:hAnsi="Times New Roman" w:eastAsia="Times New Roman" w:cs="Times New Roman"/>
+          <w:color w:val="000000"/>
+          <w:sz w:val="22"/>
+        </w:rPr>
+        <w:t>School of Computer Science and Engineering</w:t>
+      </w:r>
+    </w:p>
+    <w:p>
+      <w:pPr>
+        <w:widowControl/>
+        <w:spacing w:after="0"/>
+        <w:ind w:firstLine="0"/>
+        <w:jc w:val="center"/>
+      </w:pPr>
+      <w:r>
+        <w:rPr>
+          <w:rFonts w:ascii="Times New Roman" w:hAnsi="Times New Roman" w:eastAsia="Times New Roman" w:cs="Times New Roman"/>
+          <w:color w:val="000000"/>
+          <w:sz w:val="22"/>
+        </w:rPr>
+        <w:t>VIT Vellore</w:t>
+      </w:r>
+    </w:p>
+    <w:p>
+      <w:pPr>
+        <w:widowControl/>
+        <w:spacing w:after="480"/>
+        <w:ind w:firstLine="0"/>
+        <w:jc w:val="center"/>
+      </w:pPr>
+      <w:hyperlink r:id="rId11" w:history="1">
+        <w:r>
+          <w:rPr>
+            <w:rFonts w:ascii="Times New Roman" w:hAnsi="Times New Roman" w:eastAsia="Times New Roman" w:cs="Times New Roman"/>
+            <w:color w:val="000000"/>
+            <w:sz w:val="21"/>
+            <w:u w:val="single"/>
+          </w:rPr>
+          <w:t>poornima.n@vit.ac.in</w:t>
+        </w:r>
+      </w:hyperlink>
     </w:p>
     <w:p>
       <w:pPr>
@@ -2352,7 +2403,7 @@
                     <pic:cNvPicPr/>
                   </pic:nvPicPr>
                   <pic:blipFill>
-                    <a:blip r:embed="rId11"/>
+                    <a:blip r:embed="rId12"/>
                     <a:stretch>
                       <a:fillRect/>
                     </a:stretch>
@@ -2500,7 +2551,7 @@
                     <pic:cNvPicPr/>
                   </pic:nvPicPr>
                   <pic:blipFill>
-                    <a:blip r:embed="rId12"/>
+                    <a:blip r:embed="rId13"/>
                     <a:stretch>
                       <a:fillRect/>
                     </a:stretch>
@@ -3817,7 +3868,7 @@
                     <pic:cNvPicPr/>
                   </pic:nvPicPr>
                   <pic:blipFill>
-                    <a:blip r:embed="rId13"/>
+                    <a:blip r:embed="rId14"/>
                     <a:stretch>
                       <a:fillRect/>
                     </a:stretch>
@@ -3921,7 +3972,7 @@
                     <pic:cNvPicPr/>
                   </pic:nvPicPr>
                   <pic:blipFill>
-                    <a:blip r:embed="rId14"/>
+                    <a:blip r:embed="rId15"/>
                     <a:stretch>
                       <a:fillRect/>
                     </a:stretch>
@@ -5166,7 +5217,7 @@
                     <pic:cNvPicPr/>
                   </pic:nvPicPr>
                   <pic:blipFill>
-                    <a:blip r:embed="rId15"/>
+                    <a:blip r:embed="rId16"/>
                     <a:stretch>
                       <a:fillRect/>
                     </a:stretch>
@@ -5271,7 +5322,7 @@
                     <pic:cNvPicPr/>
                   </pic:nvPicPr>
                   <pic:blipFill>
-                    <a:blip r:embed="rId16"/>
+                    <a:blip r:embed="rId17"/>
                     <a:stretch>
                       <a:fillRect/>
                     </a:stretch>

</xml_diff>